<commit_message>
Muestra de distancia en el recomendador del mapa
</commit_message>
<xml_diff>
--- a/docs/Plan_de_pruebas_recomendador.docx
+++ b/docs/Plan_de_pruebas_recomendador.docx
@@ -70,7 +70,7 @@
         <w:rPr>
           <w:color w:val="6B5D52"/>
         </w:rPr>
-        <w:t>Versión 1.0 · Octubre de 2026</w:t>
+        <w:t>Versión 1.1 · Octubre de 2026</w:t>
       </w:r>
     </w:p>
     <w:p>
@@ -81,7 +81,7 @@
     <w:sdt>
       <w:sdtPr>
         <w:alias w:val="Contenido"/>
-        <w:id w:val="1886673309"/>
+        <w:id w:val="-468361823"/>
       </w:sdtPr>
       <w:sdtEndPr/>
       <w:sdtContent>
@@ -104,7 +104,7 @@
           <w:r>
             <w:fldChar w:fldCharType="separate"/>
           </w:r>
-          <w:hyperlink w:anchor="_Toc242807698" w:history="1">
+          <w:hyperlink w:anchor="_Toc242824849" w:history="1">
             <w:r>
               <w:rPr>
                 <w:rStyle w:val="Hipervnculo"/>
@@ -128,7 +128,7 @@
               <w:rPr>
                 <w:noProof/>
               </w:rPr>
-              <w:instrText xml:space="preserve"> PAGEREF _Toc242807698 \h </w:instrText>
+              <w:instrText xml:space="preserve"> PAGEREF _Toc242824849 \h </w:instrText>
             </w:r>
             <w:r>
               <w:rPr>
@@ -165,7 +165,7 @@
               <w:noProof/>
             </w:rPr>
           </w:pPr>
-          <w:hyperlink w:anchor="_Toc242807699" w:history="1">
+          <w:hyperlink w:anchor="_Toc242824850" w:history="1">
             <w:r>
               <w:rPr>
                 <w:rStyle w:val="Hipervnculo"/>
@@ -189,7 +189,7 @@
               <w:rPr>
                 <w:noProof/>
               </w:rPr>
-              <w:instrText xml:space="preserve"> PAGEREF _Toc242807699 \h </w:instrText>
+              <w:instrText xml:space="preserve"> PAGEREF _Toc242824850 \h </w:instrText>
             </w:r>
             <w:r>
               <w:rPr>
@@ -226,7 +226,7 @@
               <w:noProof/>
             </w:rPr>
           </w:pPr>
-          <w:hyperlink w:anchor="_Toc242807700" w:history="1">
+          <w:hyperlink w:anchor="_Toc242824851" w:history="1">
             <w:r>
               <w:rPr>
                 <w:rStyle w:val="Hipervnculo"/>
@@ -250,7 +250,7 @@
               <w:rPr>
                 <w:noProof/>
               </w:rPr>
-              <w:instrText xml:space="preserve"> PAGEREF _Toc242807700 \h </w:instrText>
+              <w:instrText xml:space="preserve"> PAGEREF _Toc242824851 \h </w:instrText>
             </w:r>
             <w:r>
               <w:rPr>
@@ -287,7 +287,7 @@
               <w:noProof/>
             </w:rPr>
           </w:pPr>
-          <w:hyperlink w:anchor="_Toc242807701" w:history="1">
+          <w:hyperlink w:anchor="_Toc242824852" w:history="1">
             <w:r>
               <w:rPr>
                 <w:rStyle w:val="Hipervnculo"/>
@@ -311,7 +311,7 @@
               <w:rPr>
                 <w:noProof/>
               </w:rPr>
-              <w:instrText xml:space="preserve"> PAGEREF _Toc242807701 \h </w:instrText>
+              <w:instrText xml:space="preserve"> PAGEREF _Toc242824852 \h </w:instrText>
             </w:r>
             <w:r>
               <w:rPr>
@@ -348,7 +348,7 @@
               <w:noProof/>
             </w:rPr>
           </w:pPr>
-          <w:hyperlink w:anchor="_Toc242807702" w:history="1">
+          <w:hyperlink w:anchor="_Toc242824853" w:history="1">
             <w:r>
               <w:rPr>
                 <w:rStyle w:val="Hipervnculo"/>
@@ -372,7 +372,7 @@
               <w:rPr>
                 <w:noProof/>
               </w:rPr>
-              <w:instrText xml:space="preserve"> PAGEREF _Toc242807702 \h </w:instrText>
+              <w:instrText xml:space="preserve"> PAGEREF _Toc242824853 \h </w:instrText>
             </w:r>
             <w:r>
               <w:rPr>
@@ -409,7 +409,7 @@
               <w:noProof/>
             </w:rPr>
           </w:pPr>
-          <w:hyperlink w:anchor="_Toc242807703" w:history="1">
+          <w:hyperlink w:anchor="_Toc242824854" w:history="1">
             <w:r>
               <w:rPr>
                 <w:rStyle w:val="Hipervnculo"/>
@@ -433,7 +433,7 @@
               <w:rPr>
                 <w:noProof/>
               </w:rPr>
-              <w:instrText xml:space="preserve"> PAGEREF _Toc242807703 \h </w:instrText>
+              <w:instrText xml:space="preserve"> PAGEREF _Toc242824854 \h </w:instrText>
             </w:r>
             <w:r>
               <w:rPr>
@@ -470,7 +470,7 @@
               <w:noProof/>
             </w:rPr>
           </w:pPr>
-          <w:hyperlink w:anchor="_Toc242807704" w:history="1">
+          <w:hyperlink w:anchor="_Toc242824855" w:history="1">
             <w:r>
               <w:rPr>
                 <w:rStyle w:val="Hipervnculo"/>
@@ -494,7 +494,7 @@
               <w:rPr>
                 <w:noProof/>
               </w:rPr>
-              <w:instrText xml:space="preserve"> PAGEREF _Toc242807704 \h </w:instrText>
+              <w:instrText xml:space="preserve"> PAGEREF _Toc242824855 \h </w:instrText>
             </w:r>
             <w:r>
               <w:rPr>
@@ -531,7 +531,7 @@
               <w:noProof/>
             </w:rPr>
           </w:pPr>
-          <w:hyperlink w:anchor="_Toc242807705" w:history="1">
+          <w:hyperlink w:anchor="_Toc242824856" w:history="1">
             <w:r>
               <w:rPr>
                 <w:rStyle w:val="Hipervnculo"/>
@@ -555,7 +555,7 @@
               <w:rPr>
                 <w:noProof/>
               </w:rPr>
-              <w:instrText xml:space="preserve"> PAGEREF _Toc242807705 \h </w:instrText>
+              <w:instrText xml:space="preserve"> PAGEREF _Toc242824856 \h </w:instrText>
             </w:r>
             <w:r>
               <w:rPr>
@@ -592,7 +592,7 @@
               <w:noProof/>
             </w:rPr>
           </w:pPr>
-          <w:hyperlink w:anchor="_Toc242807706" w:history="1">
+          <w:hyperlink w:anchor="_Toc242824857" w:history="1">
             <w:r>
               <w:rPr>
                 <w:rStyle w:val="Hipervnculo"/>
@@ -616,7 +616,7 @@
               <w:rPr>
                 <w:noProof/>
               </w:rPr>
-              <w:instrText xml:space="preserve"> PAGEREF _Toc242807706 \h </w:instrText>
+              <w:instrText xml:space="preserve"> PAGEREF _Toc242824857 \h </w:instrText>
             </w:r>
             <w:r>
               <w:rPr>
@@ -633,7 +633,7 @@
               <w:rPr>
                 <w:noProof/>
               </w:rPr>
-              <w:t>5</w:t>
+              <w:t>6</w:t>
             </w:r>
             <w:r>
               <w:rPr>
@@ -653,7 +653,7 @@
               <w:noProof/>
             </w:rPr>
           </w:pPr>
-          <w:hyperlink w:anchor="_Toc242807707" w:history="1">
+          <w:hyperlink w:anchor="_Toc242824858" w:history="1">
             <w:r>
               <w:rPr>
                 <w:rStyle w:val="Hipervnculo"/>
@@ -677,7 +677,7 @@
               <w:rPr>
                 <w:noProof/>
               </w:rPr>
-              <w:instrText xml:space="preserve"> PAGEREF _Toc242807707 \h </w:instrText>
+              <w:instrText xml:space="preserve"> PAGEREF _Toc242824858 \h </w:instrText>
             </w:r>
             <w:r>
               <w:rPr>
@@ -694,7 +694,7 @@
               <w:rPr>
                 <w:noProof/>
               </w:rPr>
-              <w:t>5</w:t>
+              <w:t>6</w:t>
             </w:r>
             <w:r>
               <w:rPr>
@@ -714,7 +714,7 @@
               <w:noProof/>
             </w:rPr>
           </w:pPr>
-          <w:hyperlink w:anchor="_Toc242807708" w:history="1">
+          <w:hyperlink w:anchor="_Toc242824859" w:history="1">
             <w:r>
               <w:rPr>
                 <w:rStyle w:val="Hipervnculo"/>
@@ -738,7 +738,7 @@
               <w:rPr>
                 <w:noProof/>
               </w:rPr>
-              <w:instrText xml:space="preserve"> PAGEREF _Toc242807708 \h </w:instrText>
+              <w:instrText xml:space="preserve"> PAGEREF _Toc242824859 \h </w:instrText>
             </w:r>
             <w:r>
               <w:rPr>
@@ -782,7 +782,7 @@
         <w:pStyle w:val="Ttulo1"/>
         <w:spacing w:before="320" w:after="160"/>
       </w:pPr>
-      <w:bookmarkStart w:id="0" w:name="_Toc242807698"/>
+      <w:bookmarkStart w:id="0" w:name="_Toc242824849"/>
       <w:r>
         <w:t>1. Objetivo</w:t>
       </w:r>
@@ -801,7 +801,7 @@
         <w:pStyle w:val="Ttulo1"/>
         <w:spacing w:before="320" w:after="160"/>
       </w:pPr>
-      <w:bookmarkStart w:id="1" w:name="_Toc242807699"/>
+      <w:bookmarkStart w:id="1" w:name="_Toc242824850"/>
       <w:r>
         <w:t>2. Alcance</w:t>
       </w:r>
@@ -880,7 +880,7 @@
         <w:pStyle w:val="Ttulo1"/>
         <w:spacing w:before="320" w:after="160"/>
       </w:pPr>
-      <w:bookmarkStart w:id="2" w:name="_Toc242807700"/>
+      <w:bookmarkStart w:id="2" w:name="_Toc242824851"/>
       <w:r>
         <w:t>3. Descripción del motor</w:t>
       </w:r>
@@ -891,7 +891,7 @@
         <w:spacing w:after="120"/>
       </w:pPr>
       <w:r>
-        <w:t>Cada negocio recibe un puntaje de 0 a 100 como suma ponderada de cinco componentes. Los pesos provienen de la Tabla 14 de la encuesta del trabajo de grado. Un componente que no aplica (por ejemplo, la cercanía cuando el cliente no comparte su ubicación) se omite y su peso se reparte entre los demás.</w:t>
+        <w:t>Cada negocio recibe un puntaje de 0 a 100 como suma ponderada de cinco componentes. Los pesos son los de la Tabla 16 del documento (menciones de cada variable sobre 192) y suman 1,000. Un componente que no aplica (por ejemplo, la cercanía cuando el cliente no comparte su ubicación) se omite y su peso se reparte entre los demás, de modo que la fórmula siempre suma 1.</w:t>
       </w:r>
     </w:p>
     <w:tbl>
@@ -942,7 +942,7 @@
                 <w:sz w:val="19"/>
                 <w:szCs w:val="19"/>
               </w:rPr>
-              <w:t>Componente</w:t>
+              <w:t>Variable</w:t>
             </w:r>
           </w:p>
         </w:tc>
@@ -1056,7 +1056,7 @@
                 <w:sz w:val="19"/>
                 <w:szCs w:val="19"/>
               </w:rPr>
-              <w:t>24%</w:t>
+              <w:t>0,245</w:t>
             </w:r>
           </w:p>
         </w:tc>
@@ -1082,7 +1082,7 @@
                 <w:sz w:val="19"/>
                 <w:szCs w:val="19"/>
               </w:rPr>
-              <w:t>1 si el servicio más barato cabe en el presupuesto; baja en línea recta hasta 0 al doble del presupuesto.</w:t>
+              <w:t>Con presupuesto: 1 si el servicio más barato cabe; baja en línea recta hasta 0 al doble del presupuesto. Sin presupuesto: posición en el rango de precios del barrio para ese servicio (1 el más económico, 0 el más costoso), comparando solo negocios que lo ofrecen.</w:t>
             </w:r>
           </w:p>
         </w:tc>
@@ -1110,7 +1110,7 @@
                 <w:sz w:val="19"/>
                 <w:szCs w:val="19"/>
               </w:rPr>
-              <w:t>Historial</w:t>
+              <w:t>Experiencias previas</w:t>
             </w:r>
           </w:p>
         </w:tc>
@@ -1136,7 +1136,7 @@
                 <w:sz w:val="19"/>
                 <w:szCs w:val="19"/>
               </w:rPr>
-              <w:t>21%</w:t>
+              <w:t>0,214</w:t>
             </w:r>
           </w:p>
         </w:tc>
@@ -1190,7 +1190,7 @@
                 <w:sz w:val="19"/>
                 <w:szCs w:val="19"/>
               </w:rPr>
-              <w:t>Cercanía</w:t>
+              <w:t>Calificación</w:t>
             </w:r>
           </w:p>
         </w:tc>
@@ -1216,7 +1216,7 @@
                 <w:sz w:val="19"/>
                 <w:szCs w:val="19"/>
               </w:rPr>
-              <w:t>19%</w:t>
+              <w:t>0,182</w:t>
             </w:r>
           </w:p>
         </w:tc>
@@ -1242,7 +1242,7 @@
                 <w:sz w:val="19"/>
                 <w:szCs w:val="19"/>
               </w:rPr>
-              <w:t>1 en el mismo punto; 0 a 2 km o más.</w:t>
+              <w:t>Promedio bayesiano: suma 5 votos con el promedio del barrio para que pocas reseñas no inflen ni castiguen la nota.</w:t>
             </w:r>
           </w:p>
         </w:tc>
@@ -1270,7 +1270,7 @@
                 <w:sz w:val="19"/>
                 <w:szCs w:val="19"/>
               </w:rPr>
-              <w:t>Servicio</w:t>
+              <w:t>Ubicación</w:t>
             </w:r>
           </w:p>
         </w:tc>
@@ -1296,7 +1296,7 @@
                 <w:sz w:val="19"/>
                 <w:szCs w:val="19"/>
               </w:rPr>
-              <w:t>18%</w:t>
+              <w:t>0,182</w:t>
             </w:r>
           </w:p>
         </w:tc>
@@ -1322,7 +1322,7 @@
                 <w:sz w:val="19"/>
                 <w:szCs w:val="19"/>
               </w:rPr>
-              <w:t>Fracción de los términos buscados que aparecen en los servicios o especialidades del negocio.</w:t>
+              <w:t>Distancia de Haversine entre cliente y negocio: 1 en el mismo punto, baja en línea recta hasta 0 a los 2 km. La distancia también se muestra en cada tarjeta ("a 520 m").</w:t>
             </w:r>
           </w:p>
         </w:tc>
@@ -1350,7 +1350,7 @@
                 <w:sz w:val="19"/>
                 <w:szCs w:val="19"/>
               </w:rPr>
-              <w:t>Calificación</w:t>
+              <w:t>Tipo de servicio</w:t>
             </w:r>
           </w:p>
         </w:tc>
@@ -1376,7 +1376,7 @@
                 <w:sz w:val="19"/>
                 <w:szCs w:val="19"/>
               </w:rPr>
-              <w:t>18%</w:t>
+              <w:t>0,177</w:t>
             </w:r>
           </w:p>
         </w:tc>
@@ -1402,7 +1402,7 @@
                 <w:sz w:val="19"/>
                 <w:szCs w:val="19"/>
               </w:rPr>
-              <w:t>Promedio bayesiano: suma 5 votos con el promedio del barrio para que pocas reseñas no inflen ni castiguen la nota.</w:t>
+              <w:t>Fracción de los términos buscados que aparecen en los servicios o especialidades del negocio.</w:t>
             </w:r>
           </w:p>
         </w:tc>
@@ -1418,7 +1418,7 @@
         <w:pStyle w:val="Ttulo2"/>
         <w:spacing w:before="220" w:after="120"/>
       </w:pPr>
-      <w:bookmarkStart w:id="3" w:name="_Toc242807701"/>
+      <w:bookmarkStart w:id="3" w:name="_Toc242824852"/>
       <w:r>
         <w:t>3.1 Mejoras incorporadas (octubre de 2026)</w:t>
       </w:r>
@@ -1771,7 +1771,61 @@
                 <w:sz w:val="19"/>
                 <w:szCs w:val="19"/>
               </w:rPr>
-              <w:t>Una ubicación a más de 2 km de Britalia o con más de 1.000 m de error no se usa para la cercanía.</w:t>
+              <w:t>Una ubicación a más de 2 km de Britalia o con más de 1.000 m de error no se usa para la cercanía ni para mostrar distancias.</w:t>
+            </w:r>
+          </w:p>
+        </w:tc>
+      </w:tr>
+      <w:tr>
+        <w:tc>
+          <w:tcPr>
+            <w:tcW w:w="2600" w:type="dxa"/>
+            <w:tcBorders>
+              <w:top w:val="single" w:sz="4" w:space="0" w:color="D9CFC4"/>
+              <w:left w:val="single" w:sz="4" w:space="0" w:color="D9CFC4"/>
+              <w:bottom w:val="single" w:sz="4" w:space="0" w:color="D9CFC4"/>
+              <w:right w:val="single" w:sz="4" w:space="0" w:color="D9CFC4"/>
+            </w:tcBorders>
+            <w:tcMar>
+              <w:top w:w="70" w:type="dxa"/>
+              <w:left w:w="100" w:type="dxa"/>
+              <w:bottom w:w="70" w:type="dxa"/>
+              <w:right w:w="100" w:type="dxa"/>
+            </w:tcMar>
+          </w:tcPr>
+          <w:p>
+            <w:r>
+              <w:rPr>
+                <w:sz w:val="19"/>
+                <w:szCs w:val="19"/>
+              </w:rPr>
+              <w:t>Pesos y precio</w:t>
+            </w:r>
+          </w:p>
+        </w:tc>
+        <w:tc>
+          <w:tcPr>
+            <w:tcW w:w="7038" w:type="dxa"/>
+            <w:tcBorders>
+              <w:top w:val="single" w:sz="4" w:space="0" w:color="D9CFC4"/>
+              <w:left w:val="single" w:sz="4" w:space="0" w:color="D9CFC4"/>
+              <w:bottom w:val="single" w:sz="4" w:space="0" w:color="D9CFC4"/>
+              <w:right w:val="single" w:sz="4" w:space="0" w:color="D9CFC4"/>
+            </w:tcBorders>
+            <w:tcMar>
+              <w:top w:w="70" w:type="dxa"/>
+              <w:left w:w="100" w:type="dxa"/>
+              <w:bottom w:w="70" w:type="dxa"/>
+              <w:right w:w="100" w:type="dxa"/>
+            </w:tcMar>
+          </w:tcPr>
+          <w:p>
+            <w:r>
+              <w:rPr>
+                <w:sz w:val="19"/>
+                <w:szCs w:val="19"/>
+              </w:rPr>
+              <w:t>Pesos alineados con la Tabla 16. El precio se compara con el rango de precios del barrio cuando el cliente no indica presupuesto.</w:t>
             </w:r>
           </w:p>
         </w:tc>
@@ -1782,7 +1836,7 @@
         <w:pStyle w:val="Ttulo1"/>
         <w:spacing w:before="320" w:after="160"/>
       </w:pPr>
-      <w:bookmarkStart w:id="4" w:name="_Toc242807702"/>
+      <w:bookmarkStart w:id="4" w:name="_Toc242824853"/>
       <w:r>
         <w:t>4. Entorno de pruebas</w:t>
       </w:r>
@@ -2097,7 +2151,7 @@
         <w:pStyle w:val="Ttulo2"/>
         <w:spacing w:before="220" w:after="120"/>
       </w:pPr>
-      <w:bookmarkStart w:id="5" w:name="_Toc242807703"/>
+      <w:bookmarkStart w:id="5" w:name="_Toc242824854"/>
       <w:r>
         <w:t>4.1 Datos de prueba (modo demo)</w:t>
       </w:r>
@@ -2834,7 +2888,7 @@
         <w:pStyle w:val="Ttulo1"/>
         <w:spacing w:before="320" w:after="160"/>
       </w:pPr>
-      <w:bookmarkStart w:id="6" w:name="_Toc242807704"/>
+      <w:bookmarkStart w:id="6" w:name="_Toc242824855"/>
       <w:r>
         <w:t>5. Pruebas automatizadas</w:t>
       </w:r>
@@ -2845,7 +2899,7 @@
         <w:spacing w:after="120"/>
       </w:pPr>
       <w:r>
-        <w:t>Se ejecutan con npm test. Resultado al momento de redactar este plan: 8 pruebas aprobadas, 0 fallidas.</w:t>
+        <w:t>Se ejecutan con npm test. Resultado al momento de redactar este plan: 11 pruebas aprobadas, 0 fallidas.</w:t>
       </w:r>
     </w:p>
     <w:tbl>
@@ -3840,13 +3894,331 @@
           </w:p>
         </w:tc>
       </w:tr>
+      <w:tr>
+        <w:tc>
+          <w:tcPr>
+            <w:tcW w:w="900" w:type="dxa"/>
+            <w:tcBorders>
+              <w:top w:val="single" w:sz="4" w:space="0" w:color="D9CFC4"/>
+              <w:left w:val="single" w:sz="4" w:space="0" w:color="D9CFC4"/>
+              <w:bottom w:val="single" w:sz="4" w:space="0" w:color="D9CFC4"/>
+              <w:right w:val="single" w:sz="4" w:space="0" w:color="D9CFC4"/>
+            </w:tcBorders>
+            <w:tcMar>
+              <w:top w:w="70" w:type="dxa"/>
+              <w:left w:w="100" w:type="dxa"/>
+              <w:bottom w:w="70" w:type="dxa"/>
+              <w:right w:w="100" w:type="dxa"/>
+            </w:tcMar>
+          </w:tcPr>
+          <w:p>
+            <w:r>
+              <w:rPr>
+                <w:sz w:val="19"/>
+                <w:szCs w:val="19"/>
+              </w:rPr>
+              <w:t>PA-09</w:t>
+            </w:r>
+          </w:p>
+        </w:tc>
+        <w:tc>
+          <w:tcPr>
+            <w:tcW w:w="2700" w:type="dxa"/>
+            <w:tcBorders>
+              <w:top w:val="single" w:sz="4" w:space="0" w:color="D9CFC4"/>
+              <w:left w:val="single" w:sz="4" w:space="0" w:color="D9CFC4"/>
+              <w:bottom w:val="single" w:sz="4" w:space="0" w:color="D9CFC4"/>
+              <w:right w:val="single" w:sz="4" w:space="0" w:color="D9CFC4"/>
+            </w:tcBorders>
+            <w:tcMar>
+              <w:top w:w="70" w:type="dxa"/>
+              <w:left w:w="100" w:type="dxa"/>
+              <w:bottom w:w="70" w:type="dxa"/>
+              <w:right w:w="100" w:type="dxa"/>
+            </w:tcMar>
+          </w:tcPr>
+          <w:p>
+            <w:r>
+              <w:rPr>
+                <w:sz w:val="19"/>
+                <w:szCs w:val="19"/>
+              </w:rPr>
+              <w:t>Pesos de la Tabla 16</w:t>
+            </w:r>
+          </w:p>
+        </w:tc>
+        <w:tc>
+          <w:tcPr>
+            <w:tcW w:w="4338" w:type="dxa"/>
+            <w:tcBorders>
+              <w:top w:val="single" w:sz="4" w:space="0" w:color="D9CFC4"/>
+              <w:left w:val="single" w:sz="4" w:space="0" w:color="D9CFC4"/>
+              <w:bottom w:val="single" w:sz="4" w:space="0" w:color="D9CFC4"/>
+              <w:right w:val="single" w:sz="4" w:space="0" w:color="D9CFC4"/>
+            </w:tcBorders>
+            <w:tcMar>
+              <w:top w:w="70" w:type="dxa"/>
+              <w:left w:w="100" w:type="dxa"/>
+              <w:bottom w:w="70" w:type="dxa"/>
+              <w:right w:w="100" w:type="dxa"/>
+            </w:tcMar>
+          </w:tcPr>
+          <w:p>
+            <w:r>
+              <w:rPr>
+                <w:sz w:val="19"/>
+                <w:szCs w:val="19"/>
+              </w:rPr>
+              <w:t>Los pesos del código son exactamente 0,245 / 0,214 / 0,182 / 0,182 / 0,177 y suman 1.</w:t>
+            </w:r>
+          </w:p>
+        </w:tc>
+        <w:tc>
+          <w:tcPr>
+            <w:tcW w:w="1700" w:type="dxa"/>
+            <w:tcBorders>
+              <w:top w:val="single" w:sz="4" w:space="0" w:color="D9CFC4"/>
+              <w:left w:val="single" w:sz="4" w:space="0" w:color="D9CFC4"/>
+              <w:bottom w:val="single" w:sz="4" w:space="0" w:color="D9CFC4"/>
+              <w:right w:val="single" w:sz="4" w:space="0" w:color="D9CFC4"/>
+            </w:tcBorders>
+            <w:tcMar>
+              <w:top w:w="70" w:type="dxa"/>
+              <w:left w:w="100" w:type="dxa"/>
+              <w:bottom w:w="70" w:type="dxa"/>
+              <w:right w:w="100" w:type="dxa"/>
+            </w:tcMar>
+          </w:tcPr>
+          <w:p>
+            <w:r>
+              <w:rPr>
+                <w:sz w:val="19"/>
+                <w:szCs w:val="19"/>
+              </w:rPr>
+              <w:t>Aprobada</w:t>
+            </w:r>
+          </w:p>
+        </w:tc>
+      </w:tr>
+      <w:tr>
+        <w:tc>
+          <w:tcPr>
+            <w:tcW w:w="900" w:type="dxa"/>
+            <w:tcBorders>
+              <w:top w:val="single" w:sz="4" w:space="0" w:color="D9CFC4"/>
+              <w:left w:val="single" w:sz="4" w:space="0" w:color="D9CFC4"/>
+              <w:bottom w:val="single" w:sz="4" w:space="0" w:color="D9CFC4"/>
+              <w:right w:val="single" w:sz="4" w:space="0" w:color="D9CFC4"/>
+            </w:tcBorders>
+            <w:tcMar>
+              <w:top w:w="70" w:type="dxa"/>
+              <w:left w:w="100" w:type="dxa"/>
+              <w:bottom w:w="70" w:type="dxa"/>
+              <w:right w:w="100" w:type="dxa"/>
+            </w:tcMar>
+          </w:tcPr>
+          <w:p>
+            <w:r>
+              <w:rPr>
+                <w:sz w:val="19"/>
+                <w:szCs w:val="19"/>
+              </w:rPr>
+              <w:t>PA-10</w:t>
+            </w:r>
+          </w:p>
+        </w:tc>
+        <w:tc>
+          <w:tcPr>
+            <w:tcW w:w="2700" w:type="dxa"/>
+            <w:tcBorders>
+              <w:top w:val="single" w:sz="4" w:space="0" w:color="D9CFC4"/>
+              <w:left w:val="single" w:sz="4" w:space="0" w:color="D9CFC4"/>
+              <w:bottom w:val="single" w:sz="4" w:space="0" w:color="D9CFC4"/>
+              <w:right w:val="single" w:sz="4" w:space="0" w:color="D9CFC4"/>
+            </w:tcBorders>
+            <w:tcMar>
+              <w:top w:w="70" w:type="dxa"/>
+              <w:left w:w="100" w:type="dxa"/>
+              <w:bottom w:w="70" w:type="dxa"/>
+              <w:right w:w="100" w:type="dxa"/>
+            </w:tcMar>
+          </w:tcPr>
+          <w:p>
+            <w:r>
+              <w:rPr>
+                <w:sz w:val="19"/>
+                <w:szCs w:val="19"/>
+              </w:rPr>
+              <w:t>Rango de precios</w:t>
+            </w:r>
+          </w:p>
+        </w:tc>
+        <w:tc>
+          <w:tcPr>
+            <w:tcW w:w="4338" w:type="dxa"/>
+            <w:tcBorders>
+              <w:top w:val="single" w:sz="4" w:space="0" w:color="D9CFC4"/>
+              <w:left w:val="single" w:sz="4" w:space="0" w:color="D9CFC4"/>
+              <w:bottom w:val="single" w:sz="4" w:space="0" w:color="D9CFC4"/>
+              <w:right w:val="single" w:sz="4" w:space="0" w:color="D9CFC4"/>
+            </w:tcBorders>
+            <w:tcMar>
+              <w:top w:w="70" w:type="dxa"/>
+              <w:left w:w="100" w:type="dxa"/>
+              <w:bottom w:w="70" w:type="dxa"/>
+              <w:right w:w="100" w:type="dxa"/>
+            </w:tcMar>
+          </w:tcPr>
+          <w:p>
+            <w:r>
+              <w:rPr>
+                <w:sz w:val="19"/>
+                <w:szCs w:val="19"/>
+              </w:rPr>
+              <w:t>Sin presupuesto, el negocio de $10.000 queda primero frente al de $30.000 (precio 1 y 0) y muestra "De los más económicos".</w:t>
+            </w:r>
+          </w:p>
+        </w:tc>
+        <w:tc>
+          <w:tcPr>
+            <w:tcW w:w="1700" w:type="dxa"/>
+            <w:tcBorders>
+              <w:top w:val="single" w:sz="4" w:space="0" w:color="D9CFC4"/>
+              <w:left w:val="single" w:sz="4" w:space="0" w:color="D9CFC4"/>
+              <w:bottom w:val="single" w:sz="4" w:space="0" w:color="D9CFC4"/>
+              <w:right w:val="single" w:sz="4" w:space="0" w:color="D9CFC4"/>
+            </w:tcBorders>
+            <w:tcMar>
+              <w:top w:w="70" w:type="dxa"/>
+              <w:left w:w="100" w:type="dxa"/>
+              <w:bottom w:w="70" w:type="dxa"/>
+              <w:right w:w="100" w:type="dxa"/>
+            </w:tcMar>
+          </w:tcPr>
+          <w:p>
+            <w:r>
+              <w:rPr>
+                <w:sz w:val="19"/>
+                <w:szCs w:val="19"/>
+              </w:rPr>
+              <w:t>Aprobada</w:t>
+            </w:r>
+          </w:p>
+        </w:tc>
+      </w:tr>
+      <w:tr>
+        <w:tc>
+          <w:tcPr>
+            <w:tcW w:w="900" w:type="dxa"/>
+            <w:tcBorders>
+              <w:top w:val="single" w:sz="4" w:space="0" w:color="D9CFC4"/>
+              <w:left w:val="single" w:sz="4" w:space="0" w:color="D9CFC4"/>
+              <w:bottom w:val="single" w:sz="4" w:space="0" w:color="D9CFC4"/>
+              <w:right w:val="single" w:sz="4" w:space="0" w:color="D9CFC4"/>
+            </w:tcBorders>
+            <w:tcMar>
+              <w:top w:w="70" w:type="dxa"/>
+              <w:left w:w="100" w:type="dxa"/>
+              <w:bottom w:w="70" w:type="dxa"/>
+              <w:right w:w="100" w:type="dxa"/>
+            </w:tcMar>
+          </w:tcPr>
+          <w:p>
+            <w:r>
+              <w:rPr>
+                <w:sz w:val="19"/>
+                <w:szCs w:val="19"/>
+              </w:rPr>
+              <w:t>PA-11</w:t>
+            </w:r>
+          </w:p>
+        </w:tc>
+        <w:tc>
+          <w:tcPr>
+            <w:tcW w:w="2700" w:type="dxa"/>
+            <w:tcBorders>
+              <w:top w:val="single" w:sz="4" w:space="0" w:color="D9CFC4"/>
+              <w:left w:val="single" w:sz="4" w:space="0" w:color="D9CFC4"/>
+              <w:bottom w:val="single" w:sz="4" w:space="0" w:color="D9CFC4"/>
+              <w:right w:val="single" w:sz="4" w:space="0" w:color="D9CFC4"/>
+            </w:tcBorders>
+            <w:tcMar>
+              <w:top w:w="70" w:type="dxa"/>
+              <w:left w:w="100" w:type="dxa"/>
+              <w:bottom w:w="70" w:type="dxa"/>
+              <w:right w:w="100" w:type="dxa"/>
+            </w:tcMar>
+          </w:tcPr>
+          <w:p>
+            <w:r>
+              <w:rPr>
+                <w:sz w:val="19"/>
+                <w:szCs w:val="19"/>
+              </w:rPr>
+              <w:t>Rango por servicio</w:t>
+            </w:r>
+          </w:p>
+        </w:tc>
+        <w:tc>
+          <w:tcPr>
+            <w:tcW w:w="4338" w:type="dxa"/>
+            <w:tcBorders>
+              <w:top w:val="single" w:sz="4" w:space="0" w:color="D9CFC4"/>
+              <w:left w:val="single" w:sz="4" w:space="0" w:color="D9CFC4"/>
+              <w:bottom w:val="single" w:sz="4" w:space="0" w:color="D9CFC4"/>
+              <w:right w:val="single" w:sz="4" w:space="0" w:color="D9CFC4"/>
+            </w:tcBorders>
+            <w:tcMar>
+              <w:top w:w="70" w:type="dxa"/>
+              <w:left w:w="100" w:type="dxa"/>
+              <w:bottom w:w="70" w:type="dxa"/>
+              <w:right w:w="100" w:type="dxa"/>
+            </w:tcMar>
+          </w:tcPr>
+          <w:p>
+            <w:r>
+              <w:rPr>
+                <w:sz w:val="19"/>
+                <w:szCs w:val="19"/>
+              </w:rPr>
+              <w:t>Al buscar "tinte", el único que lo ofrece no se castiga por costar más que un corte de otro negocio.</w:t>
+            </w:r>
+          </w:p>
+        </w:tc>
+        <w:tc>
+          <w:tcPr>
+            <w:tcW w:w="1700" w:type="dxa"/>
+            <w:tcBorders>
+              <w:top w:val="single" w:sz="4" w:space="0" w:color="D9CFC4"/>
+              <w:left w:val="single" w:sz="4" w:space="0" w:color="D9CFC4"/>
+              <w:bottom w:val="single" w:sz="4" w:space="0" w:color="D9CFC4"/>
+              <w:right w:val="single" w:sz="4" w:space="0" w:color="D9CFC4"/>
+            </w:tcBorders>
+            <w:tcMar>
+              <w:top w:w="70" w:type="dxa"/>
+              <w:left w:w="100" w:type="dxa"/>
+              <w:bottom w:w="70" w:type="dxa"/>
+              <w:right w:w="100" w:type="dxa"/>
+            </w:tcMar>
+          </w:tcPr>
+          <w:p>
+            <w:r>
+              <w:rPr>
+                <w:sz w:val="19"/>
+                <w:szCs w:val="19"/>
+              </w:rPr>
+              <w:t>Aprobada</w:t>
+            </w:r>
+          </w:p>
+        </w:tc>
+      </w:tr>
     </w:tbl>
     <w:p>
       <w:pPr>
         <w:pStyle w:val="Ttulo1"/>
         <w:spacing w:before="320" w:after="160"/>
       </w:pPr>
-      <w:bookmarkStart w:id="7" w:name="_Toc242807705"/>
+      <w:bookmarkStart w:id="7" w:name="_Toc242824856"/>
       <w:r>
         <w:t>6. Pruebas manuales</w:t>
       </w:r>
@@ -5486,13 +5858,297 @@
           <w:p/>
         </w:tc>
       </w:tr>
+      <w:tr>
+        <w:tc>
+          <w:tcPr>
+            <w:tcW w:w="800" w:type="dxa"/>
+            <w:tcBorders>
+              <w:top w:val="single" w:sz="4" w:space="0" w:color="D9CFC4"/>
+              <w:left w:val="single" w:sz="4" w:space="0" w:color="D9CFC4"/>
+              <w:bottom w:val="single" w:sz="4" w:space="0" w:color="D9CFC4"/>
+              <w:right w:val="single" w:sz="4" w:space="0" w:color="D9CFC4"/>
+            </w:tcBorders>
+            <w:tcMar>
+              <w:top w:w="70" w:type="dxa"/>
+              <w:left w:w="100" w:type="dxa"/>
+              <w:bottom w:w="70" w:type="dxa"/>
+              <w:right w:w="100" w:type="dxa"/>
+            </w:tcMar>
+          </w:tcPr>
+          <w:p>
+            <w:r>
+              <w:rPr>
+                <w:sz w:val="19"/>
+                <w:szCs w:val="19"/>
+              </w:rPr>
+              <w:t>PM-11</w:t>
+            </w:r>
+          </w:p>
+        </w:tc>
+        <w:tc>
+          <w:tcPr>
+            <w:tcW w:w="1500" w:type="dxa"/>
+            <w:tcBorders>
+              <w:top w:val="single" w:sz="4" w:space="0" w:color="D9CFC4"/>
+              <w:left w:val="single" w:sz="4" w:space="0" w:color="D9CFC4"/>
+              <w:bottom w:val="single" w:sz="4" w:space="0" w:color="D9CFC4"/>
+              <w:right w:val="single" w:sz="4" w:space="0" w:color="D9CFC4"/>
+            </w:tcBorders>
+            <w:tcMar>
+              <w:top w:w="70" w:type="dxa"/>
+              <w:left w:w="100" w:type="dxa"/>
+              <w:bottom w:w="70" w:type="dxa"/>
+              <w:right w:w="100" w:type="dxa"/>
+            </w:tcMar>
+          </w:tcPr>
+          <w:p>
+            <w:r>
+              <w:rPr>
+                <w:sz w:val="19"/>
+                <w:szCs w:val="19"/>
+              </w:rPr>
+              <w:t>Precio sin presupuesto</w:t>
+            </w:r>
+          </w:p>
+        </w:tc>
+        <w:tc>
+          <w:tcPr>
+            <w:tcW w:w="2300" w:type="dxa"/>
+            <w:tcBorders>
+              <w:top w:val="single" w:sz="4" w:space="0" w:color="D9CFC4"/>
+              <w:left w:val="single" w:sz="4" w:space="0" w:color="D9CFC4"/>
+              <w:bottom w:val="single" w:sz="4" w:space="0" w:color="D9CFC4"/>
+              <w:right w:val="single" w:sz="4" w:space="0" w:color="D9CFC4"/>
+            </w:tcBorders>
+            <w:tcMar>
+              <w:top w:w="70" w:type="dxa"/>
+              <w:left w:w="100" w:type="dxa"/>
+              <w:bottom w:w="70" w:type="dxa"/>
+              <w:right w:w="100" w:type="dxa"/>
+            </w:tcMar>
+          </w:tcPr>
+          <w:p>
+            <w:r>
+              <w:rPr>
+                <w:sz w:val="19"/>
+                <w:szCs w:val="19"/>
+              </w:rPr>
+              <w:t>Sin filtros, revisar el orden de los negocios de prueba.</w:t>
+            </w:r>
+          </w:p>
+        </w:tc>
+        <w:tc>
+          <w:tcPr>
+            <w:tcW w:w="3038" w:type="dxa"/>
+            <w:tcBorders>
+              <w:top w:val="single" w:sz="4" w:space="0" w:color="D9CFC4"/>
+              <w:left w:val="single" w:sz="4" w:space="0" w:color="D9CFC4"/>
+              <w:bottom w:val="single" w:sz="4" w:space="0" w:color="D9CFC4"/>
+              <w:right w:val="single" w:sz="4" w:space="0" w:color="D9CFC4"/>
+            </w:tcBorders>
+            <w:tcMar>
+              <w:top w:w="70" w:type="dxa"/>
+              <w:left w:w="100" w:type="dxa"/>
+              <w:bottom w:w="70" w:type="dxa"/>
+              <w:right w:w="100" w:type="dxa"/>
+            </w:tcMar>
+          </w:tcPr>
+          <w:p>
+            <w:r>
+              <w:rPr>
+                <w:sz w:val="19"/>
+                <w:szCs w:val="19"/>
+              </w:rPr>
+              <w:t>Estilo 51 ($10.000, el más económico) queda primero con "De los más económicos"; Glow Estética ($18.000) queda último.</w:t>
+            </w:r>
+          </w:p>
+        </w:tc>
+        <w:tc>
+          <w:tcPr>
+            <w:tcW w:w="1000" w:type="dxa"/>
+            <w:tcBorders>
+              <w:top w:val="single" w:sz="4" w:space="0" w:color="D9CFC4"/>
+              <w:left w:val="single" w:sz="4" w:space="0" w:color="D9CFC4"/>
+              <w:bottom w:val="single" w:sz="4" w:space="0" w:color="D9CFC4"/>
+              <w:right w:val="single" w:sz="4" w:space="0" w:color="D9CFC4"/>
+            </w:tcBorders>
+            <w:tcMar>
+              <w:top w:w="70" w:type="dxa"/>
+              <w:left w:w="100" w:type="dxa"/>
+              <w:bottom w:w="70" w:type="dxa"/>
+              <w:right w:w="100" w:type="dxa"/>
+            </w:tcMar>
+          </w:tcPr>
+          <w:p/>
+        </w:tc>
+        <w:tc>
+          <w:tcPr>
+            <w:tcW w:w="1000" w:type="dxa"/>
+            <w:tcBorders>
+              <w:top w:val="single" w:sz="4" w:space="0" w:color="D9CFC4"/>
+              <w:left w:val="single" w:sz="4" w:space="0" w:color="D9CFC4"/>
+              <w:bottom w:val="single" w:sz="4" w:space="0" w:color="D9CFC4"/>
+              <w:right w:val="single" w:sz="4" w:space="0" w:color="D9CFC4"/>
+            </w:tcBorders>
+            <w:tcMar>
+              <w:top w:w="70" w:type="dxa"/>
+              <w:left w:w="100" w:type="dxa"/>
+              <w:bottom w:w="70" w:type="dxa"/>
+              <w:right w:w="100" w:type="dxa"/>
+            </w:tcMar>
+          </w:tcPr>
+          <w:p/>
+        </w:tc>
+      </w:tr>
+      <w:tr>
+        <w:tc>
+          <w:tcPr>
+            <w:tcW w:w="800" w:type="dxa"/>
+            <w:tcBorders>
+              <w:top w:val="single" w:sz="4" w:space="0" w:color="D9CFC4"/>
+              <w:left w:val="single" w:sz="4" w:space="0" w:color="D9CFC4"/>
+              <w:bottom w:val="single" w:sz="4" w:space="0" w:color="D9CFC4"/>
+              <w:right w:val="single" w:sz="4" w:space="0" w:color="D9CFC4"/>
+            </w:tcBorders>
+            <w:tcMar>
+              <w:top w:w="70" w:type="dxa"/>
+              <w:left w:w="100" w:type="dxa"/>
+              <w:bottom w:w="70" w:type="dxa"/>
+              <w:right w:w="100" w:type="dxa"/>
+            </w:tcMar>
+          </w:tcPr>
+          <w:p>
+            <w:r>
+              <w:rPr>
+                <w:sz w:val="19"/>
+                <w:szCs w:val="19"/>
+              </w:rPr>
+              <w:t>PM-12</w:t>
+            </w:r>
+          </w:p>
+        </w:tc>
+        <w:tc>
+          <w:tcPr>
+            <w:tcW w:w="1500" w:type="dxa"/>
+            <w:tcBorders>
+              <w:top w:val="single" w:sz="4" w:space="0" w:color="D9CFC4"/>
+              <w:left w:val="single" w:sz="4" w:space="0" w:color="D9CFC4"/>
+              <w:bottom w:val="single" w:sz="4" w:space="0" w:color="D9CFC4"/>
+              <w:right w:val="single" w:sz="4" w:space="0" w:color="D9CFC4"/>
+            </w:tcBorders>
+            <w:tcMar>
+              <w:top w:w="70" w:type="dxa"/>
+              <w:left w:w="100" w:type="dxa"/>
+              <w:bottom w:w="70" w:type="dxa"/>
+              <w:right w:w="100" w:type="dxa"/>
+            </w:tcMar>
+          </w:tcPr>
+          <w:p>
+            <w:r>
+              <w:rPr>
+                <w:sz w:val="19"/>
+                <w:szCs w:val="19"/>
+              </w:rPr>
+              <w:t>Distancia visible (HU-03)</w:t>
+            </w:r>
+          </w:p>
+        </w:tc>
+        <w:tc>
+          <w:tcPr>
+            <w:tcW w:w="2300" w:type="dxa"/>
+            <w:tcBorders>
+              <w:top w:val="single" w:sz="4" w:space="0" w:color="D9CFC4"/>
+              <w:left w:val="single" w:sz="4" w:space="0" w:color="D9CFC4"/>
+              <w:bottom w:val="single" w:sz="4" w:space="0" w:color="D9CFC4"/>
+              <w:right w:val="single" w:sz="4" w:space="0" w:color="D9CFC4"/>
+            </w:tcBorders>
+            <w:tcMar>
+              <w:top w:w="70" w:type="dxa"/>
+              <w:left w:w="100" w:type="dxa"/>
+              <w:bottom w:w="70" w:type="dxa"/>
+              <w:right w:w="100" w:type="dxa"/>
+            </w:tcMar>
+          </w:tcPr>
+          <w:p>
+            <w:r>
+              <w:rPr>
+                <w:sz w:val="19"/>
+                <w:szCs w:val="19"/>
+              </w:rPr>
+              <w:t>Pulsar "Usar mi ubicación" estando en Britalia.</w:t>
+            </w:r>
+          </w:p>
+        </w:tc>
+        <w:tc>
+          <w:tcPr>
+            <w:tcW w:w="3038" w:type="dxa"/>
+            <w:tcBorders>
+              <w:top w:val="single" w:sz="4" w:space="0" w:color="D9CFC4"/>
+              <w:left w:val="single" w:sz="4" w:space="0" w:color="D9CFC4"/>
+              <w:bottom w:val="single" w:sz="4" w:space="0" w:color="D9CFC4"/>
+              <w:right w:val="single" w:sz="4" w:space="0" w:color="D9CFC4"/>
+            </w:tcBorders>
+            <w:tcMar>
+              <w:top w:w="70" w:type="dxa"/>
+              <w:left w:w="100" w:type="dxa"/>
+              <w:bottom w:w="70" w:type="dxa"/>
+              <w:right w:w="100" w:type="dxa"/>
+            </w:tcMar>
+          </w:tcPr>
+          <w:p>
+            <w:r>
+              <w:rPr>
+                <w:sz w:val="19"/>
+                <w:szCs w:val="19"/>
+              </w:rPr>
+              <w:t>Cada tarjeta muestra la distancia antes de la dirección ("a 520 m" o "a 1,2 km").</w:t>
+            </w:r>
+          </w:p>
+        </w:tc>
+        <w:tc>
+          <w:tcPr>
+            <w:tcW w:w="1000" w:type="dxa"/>
+            <w:tcBorders>
+              <w:top w:val="single" w:sz="4" w:space="0" w:color="D9CFC4"/>
+              <w:left w:val="single" w:sz="4" w:space="0" w:color="D9CFC4"/>
+              <w:bottom w:val="single" w:sz="4" w:space="0" w:color="D9CFC4"/>
+              <w:right w:val="single" w:sz="4" w:space="0" w:color="D9CFC4"/>
+            </w:tcBorders>
+            <w:tcMar>
+              <w:top w:w="70" w:type="dxa"/>
+              <w:left w:w="100" w:type="dxa"/>
+              <w:bottom w:w="70" w:type="dxa"/>
+              <w:right w:w="100" w:type="dxa"/>
+            </w:tcMar>
+          </w:tcPr>
+          <w:p/>
+        </w:tc>
+        <w:tc>
+          <w:tcPr>
+            <w:tcW w:w="1000" w:type="dxa"/>
+            <w:tcBorders>
+              <w:top w:val="single" w:sz="4" w:space="0" w:color="D9CFC4"/>
+              <w:left w:val="single" w:sz="4" w:space="0" w:color="D9CFC4"/>
+              <w:bottom w:val="single" w:sz="4" w:space="0" w:color="D9CFC4"/>
+              <w:right w:val="single" w:sz="4" w:space="0" w:color="D9CFC4"/>
+            </w:tcBorders>
+            <w:tcMar>
+              <w:top w:w="70" w:type="dxa"/>
+              <w:left w:w="100" w:type="dxa"/>
+              <w:bottom w:w="70" w:type="dxa"/>
+              <w:right w:w="100" w:type="dxa"/>
+            </w:tcMar>
+          </w:tcPr>
+          <w:p/>
+        </w:tc>
+      </w:tr>
     </w:tbl>
     <w:p>
       <w:pPr>
         <w:pStyle w:val="Ttulo1"/>
         <w:spacing w:before="320" w:after="160"/>
       </w:pPr>
-      <w:bookmarkStart w:id="8" w:name="_Toc242807706"/>
+      <w:bookmarkStart w:id="8" w:name="_Toc242824857"/>
       <w:r>
         <w:t>7. Criterios de aceptación</w:t>
       </w:r>
@@ -5508,7 +6164,7 @@
         <w:spacing w:after="60"/>
       </w:pPr>
       <w:r>
-        <w:t>Las 8 pruebas automatizadas se aprueban (npm test sin fallos).</w:t>
+        <w:t>Las 11 pruebas automatizadas se aprueban (npm test sin fallos).</w:t>
       </w:r>
     </w:p>
     <w:p>
@@ -5521,7 +6177,20 @@
         <w:spacing w:after="60"/>
       </w:pPr>
       <w:r>
-        <w:t>Al menos 9 de las 10 pruebas manuales coinciden con el resultado esperado.</w:t>
+        <w:t>Las 11 pruebas automatizadas cubren las cuatro mejoras y los pesos de la Tabla 16.</w:t>
+      </w:r>
+    </w:p>
+    <w:p>
+      <w:pPr>
+        <w:pStyle w:val="Prrafodelista"/>
+        <w:numPr>
+          <w:ilvl w:val="0"/>
+          <w:numId w:val="2"/>
+        </w:numPr>
+        <w:spacing w:after="60"/>
+      </w:pPr>
+      <w:r>
+        <w:t>Al menos 11 de las 12 pruebas manuales coinciden con el resultado esperado.</w:t>
       </w:r>
     </w:p>
     <w:p>
@@ -5555,7 +6224,7 @@
         <w:pStyle w:val="Ttulo1"/>
         <w:spacing w:before="320" w:after="160"/>
       </w:pPr>
-      <w:bookmarkStart w:id="9" w:name="_Toc242807707"/>
+      <w:bookmarkStart w:id="9" w:name="_Toc242824858"/>
       <w:r>
         <w:t>8. Hallazgos y limitaciones conocidas</w:t>
       </w:r>
@@ -5837,7 +6506,7 @@
                 <w:sz w:val="19"/>
                 <w:szCs w:val="19"/>
               </w:rPr>
-              <w:t>Cuando el cliente tiene un solo favorito, los negocios sin especialidades en común reciben 0 en historial y su puntaje cae de forma marcada (en la simulación, Kings Barber pasó de 93 a 43 al marcar como favorito a Estilo 51).</w:t>
+              <w:t>Cuando el cliente tiene un solo favorito, los negocios sin especialidades en común reciben 0 en historial y su puntaje cae de forma marcada (en la simulación, Kings Barber pasó de 83 a 55 al marcar como favorito a Estilo 51).</w:t>
             </w:r>
           </w:p>
         </w:tc>
@@ -6008,7 +6677,7 @@
         <w:pStyle w:val="Ttulo1"/>
         <w:spacing w:before="320" w:after="160"/>
       </w:pPr>
-      <w:bookmarkStart w:id="10" w:name="_Toc242807708"/>
+      <w:bookmarkStart w:id="10" w:name="_Toc242824859"/>
       <w:r>
         <w:t>9. Registro de ejecución</w:t>
       </w:r>
@@ -6248,7 +6917,7 @@
                 <w:sz w:val="19"/>
                 <w:szCs w:val="19"/>
               </w:rPr>
-              <w:t xml:space="preserve">   / 8</w:t>
+              <w:t xml:space="preserve">   / 11</w:t>
             </w:r>
           </w:p>
         </w:tc>
@@ -6274,7 +6943,7 @@
                 <w:sz w:val="19"/>
                 <w:szCs w:val="19"/>
               </w:rPr>
-              <w:t xml:space="preserve">   / 10</w:t>
+              <w:t xml:space="preserve">   / 12</w:t>
             </w:r>
           </w:p>
         </w:tc>
@@ -6356,7 +7025,7 @@
                 <w:sz w:val="19"/>
                 <w:szCs w:val="19"/>
               </w:rPr>
-              <w:t xml:space="preserve">   / 8</w:t>
+              <w:t xml:space="preserve">   / 11</w:t>
             </w:r>
           </w:p>
         </w:tc>
@@ -6382,7 +7051,7 @@
                 <w:sz w:val="19"/>
                 <w:szCs w:val="19"/>
               </w:rPr>
-              <w:t xml:space="preserve">   / 10</w:t>
+              <w:t xml:space="preserve">   / 12</w:t>
             </w:r>
           </w:p>
         </w:tc>
@@ -6464,7 +7133,7 @@
                 <w:sz w:val="19"/>
                 <w:szCs w:val="19"/>
               </w:rPr>
-              <w:t xml:space="preserve">   / 8</w:t>
+              <w:t xml:space="preserve">   / 11</w:t>
             </w:r>
           </w:p>
         </w:tc>
@@ -6490,7 +7159,7 @@
                 <w:sz w:val="19"/>
                 <w:szCs w:val="19"/>
               </w:rPr>
-              <w:t xml:space="preserve">   / 10</w:t>
+              <w:t xml:space="preserve">   / 12</w:t>
             </w:r>
           </w:p>
         </w:tc>
@@ -6626,64 +7295,10 @@
 <file path=word/numbering.xml><?xml version="1.0" encoding="utf-8"?>
 <w:numbering xmlns:wpc="http://schemas.microsoft.com/office/word/2010/wordprocessingCanvas" xmlns:cx="http://schemas.microsoft.com/office/drawing/2014/chartex" xmlns:cx1="http://schemas.microsoft.com/office/drawing/2015/9/8/chartex" xmlns:cx2="http://schemas.microsoft.com/office/drawing/2015/10/21/chartex" xmlns:cx3="http://schemas.microsoft.com/office/drawing/2016/5/9/chartex" xmlns:cx4="http://schemas.microsoft.com/office/drawing/2016/5/10/chartex" xmlns:cx5="http://schemas.microsoft.com/office/drawing/2016/5/11/chartex" xmlns:cx6="http://schemas.microsoft.com/office/drawing/2016/5/12/chartex" xmlns:cx7="http://schemas.microsoft.com/office/drawing/2016/5/13/chartex" xmlns:cx8="http://schemas.microsoft.com/office/drawing/2016/5/14/chartex" xmlns:mc="http://schemas.openxmlformats.org/markup-compatibility/2006" xmlns:aink="http://schemas.microsoft.com/office/drawing/2016/ink" xmlns:am3d="http://schemas.microsoft.com/office/drawing/2017/model3d" xmlns:o="urn:schemas-microsoft-com:office:office" xmlns:oel="http://schemas.microsoft.com/office/2019/extlst" xmlns:r="http://schemas.openxmlformats.org/officeDocument/2006/relationships" xmlns:m="http://schemas.openxmlformats.org/officeDocument/2006/math" xmlns:v="urn:schemas-microsoft-com:vml" xmlns:wp14="http://schemas.microsoft.com/office/word/2010/wordprocessingDrawing" xmlns:wp="http://schemas.openxmlformats.org/drawingml/2006/wordprocessingDrawing" xmlns:w10="urn:schemas-microsoft-com:office:word" xmlns:w="http://schemas.openxmlformats.org/wordprocessingml/2006/main" xmlns:w14="http://schemas.microsoft.com/office/word/2010/wordml" xmlns:w15="http://schemas.microsoft.com/office/word/2012/wordml" xmlns:w16cex="http://schemas.microsoft.com/office/word/2018/wordml/cex" xmlns:w16cid="http://schemas.microsoft.com/office/word/2016/wordml/cid" xmlns:w16="http://schemas.microsoft.com/office/word/2018/wordml" xmlns:w16du="http://schemas.microsoft.com/office/word/2023/wordml/word16du" xmlns:w16sdtdh="http://schemas.microsoft.com/office/word/2020/wordml/sdtdatahash" xmlns:w16sdtfl="http://schemas.microsoft.com/office/word/2024/wordml/sdtformatlock" xmlns:w16se="http://schemas.microsoft.com/office/word/2015/wordml/symex" xmlns:wpg="http://schemas.microsoft.com/office/word/2010/wordprocessingGroup" xmlns:wpi="http://schemas.microsoft.com/office/word/2010/wordprocessingInk" xmlns:wne="http://schemas.microsoft.com/office/word/2006/wordml" xmlns:wps="http://schemas.microsoft.com/office/word/2010/wordprocessingShape" mc:Ignorable="w14 w15 w16se w16cid w16 w16cex w16sdtdh w16sdtfl w16du wp14">
   <w:abstractNum w:abstractNumId="0" w15:restartNumberingAfterBreak="0">
-    <w:nsid w:val="13AA1416"/>
+    <w:nsid w:val="2ADB57ED"/>
     <w:multiLevelType w:val="hybridMultilevel"/>
-    <w:tmpl w:val="959E6DCE"/>
-    <w:lvl w:ilvl="0" w:tplc="1396C854">
-      <w:start w:val="1"/>
-      <w:numFmt w:val="bullet"/>
-      <w:lvlText w:val="•"/>
-      <w:lvlJc w:val="left"/>
-      <w:pPr>
-        <w:ind w:left="540" w:hanging="270"/>
-      </w:pPr>
-    </w:lvl>
-    <w:lvl w:ilvl="1" w:tplc="D1EE4102">
-      <w:numFmt w:val="decimal"/>
-      <w:lvlText w:val=""/>
-      <w:lvlJc w:val="left"/>
-    </w:lvl>
-    <w:lvl w:ilvl="2" w:tplc="746CE3A0">
-      <w:numFmt w:val="decimal"/>
-      <w:lvlText w:val=""/>
-      <w:lvlJc w:val="left"/>
-    </w:lvl>
-    <w:lvl w:ilvl="3" w:tplc="243A32A4">
-      <w:numFmt w:val="decimal"/>
-      <w:lvlText w:val=""/>
-      <w:lvlJc w:val="left"/>
-    </w:lvl>
-    <w:lvl w:ilvl="4" w:tplc="0BD8BA1E">
-      <w:numFmt w:val="decimal"/>
-      <w:lvlText w:val=""/>
-      <w:lvlJc w:val="left"/>
-    </w:lvl>
-    <w:lvl w:ilvl="5" w:tplc="89864D92">
-      <w:numFmt w:val="decimal"/>
-      <w:lvlText w:val=""/>
-      <w:lvlJc w:val="left"/>
-    </w:lvl>
-    <w:lvl w:ilvl="6" w:tplc="4980309A">
-      <w:numFmt w:val="decimal"/>
-      <w:lvlText w:val=""/>
-      <w:lvlJc w:val="left"/>
-    </w:lvl>
-    <w:lvl w:ilvl="7" w:tplc="FDC88A56">
-      <w:numFmt w:val="decimal"/>
-      <w:lvlText w:val=""/>
-      <w:lvlJc w:val="left"/>
-    </w:lvl>
-    <w:lvl w:ilvl="8" w:tplc="B0C893AA">
-      <w:numFmt w:val="decimal"/>
-      <w:lvlText w:val=""/>
-      <w:lvlJc w:val="left"/>
-    </w:lvl>
-  </w:abstractNum>
-  <w:abstractNum w:abstractNumId="1" w15:restartNumberingAfterBreak="0">
-    <w:nsid w:val="64A270CB"/>
-    <w:multiLevelType w:val="hybridMultilevel"/>
-    <w:tmpl w:val="6A966B18"/>
-    <w:lvl w:ilvl="0" w:tplc="E9BA06C8" w:tentative="1">
+    <w:tmpl w:val="2BE8B66A"/>
+    <w:lvl w:ilvl="0" w:tplc="B4385D76" w:tentative="1">
       <w:start w:val="1"/>
       <w:numFmt w:val="bullet"/>
       <w:lvlText w:val="●"/>
@@ -6692,7 +7307,7 @@
         <w:ind w:left="720" w:hanging="360"/>
       </w:pPr>
     </w:lvl>
-    <w:lvl w:ilvl="1" w:tplc="6D88541C" w:tentative="1">
+    <w:lvl w:ilvl="1" w:tplc="EB28149E" w:tentative="1">
       <w:start w:val="1"/>
       <w:numFmt w:val="bullet"/>
       <w:lvlText w:val="○"/>
@@ -6701,7 +7316,7 @@
         <w:ind w:left="1440" w:hanging="360"/>
       </w:pPr>
     </w:lvl>
-    <w:lvl w:ilvl="2" w:tplc="40A8EE3A" w:tentative="1">
+    <w:lvl w:ilvl="2" w:tplc="41A82D8E" w:tentative="1">
       <w:start w:val="1"/>
       <w:numFmt w:val="bullet"/>
       <w:lvlText w:val="■"/>
@@ -6710,7 +7325,7 @@
         <w:ind w:left="2160" w:hanging="360"/>
       </w:pPr>
     </w:lvl>
-    <w:lvl w:ilvl="3" w:tplc="B914E932" w:tentative="1">
+    <w:lvl w:ilvl="3" w:tplc="E6B2CC20" w:tentative="1">
       <w:start w:val="1"/>
       <w:numFmt w:val="bullet"/>
       <w:lvlText w:val="●"/>
@@ -6719,7 +7334,7 @@
         <w:ind w:left="2880" w:hanging="360"/>
       </w:pPr>
     </w:lvl>
-    <w:lvl w:ilvl="4" w:tplc="D7EE44DC" w:tentative="1">
+    <w:lvl w:ilvl="4" w:tplc="69ECF13A" w:tentative="1">
       <w:start w:val="1"/>
       <w:numFmt w:val="bullet"/>
       <w:lvlText w:val="○"/>
@@ -6728,7 +7343,7 @@
         <w:ind w:left="3600" w:hanging="360"/>
       </w:pPr>
     </w:lvl>
-    <w:lvl w:ilvl="5" w:tplc="30D85544" w:tentative="1">
+    <w:lvl w:ilvl="5" w:tplc="D124F484" w:tentative="1">
       <w:start w:val="1"/>
       <w:numFmt w:val="bullet"/>
       <w:lvlText w:val="■"/>
@@ -6737,7 +7352,7 @@
         <w:ind w:left="4320" w:hanging="360"/>
       </w:pPr>
     </w:lvl>
-    <w:lvl w:ilvl="6" w:tplc="A6384CD0" w:tentative="1">
+    <w:lvl w:ilvl="6" w:tplc="F50A0C94" w:tentative="1">
       <w:start w:val="1"/>
       <w:numFmt w:val="bullet"/>
       <w:lvlText w:val="●"/>
@@ -6746,7 +7361,7 @@
         <w:ind w:left="5040" w:hanging="360"/>
       </w:pPr>
     </w:lvl>
-    <w:lvl w:ilvl="7" w:tplc="2050EDBE" w:tentative="1">
+    <w:lvl w:ilvl="7" w:tplc="E8DE0BF4" w:tentative="1">
       <w:start w:val="1"/>
       <w:numFmt w:val="bullet"/>
       <w:lvlText w:val="●"/>
@@ -6755,7 +7370,7 @@
         <w:ind w:left="5760" w:hanging="360"/>
       </w:pPr>
     </w:lvl>
-    <w:lvl w:ilvl="8" w:tplc="4C829430" w:tentative="1">
+    <w:lvl w:ilvl="8" w:tplc="0E0EB4A0" w:tentative="1">
       <w:start w:val="1"/>
       <w:numFmt w:val="bullet"/>
       <w:lvlText w:val="●"/>
@@ -6765,14 +7380,68 @@
       </w:pPr>
     </w:lvl>
   </w:abstractNum>
-  <w:num w:numId="1" w16cid:durableId="625769259">
-    <w:abstractNumId w:val="1"/>
+  <w:abstractNum w:abstractNumId="1" w15:restartNumberingAfterBreak="0">
+    <w:nsid w:val="7543535A"/>
+    <w:multiLevelType w:val="hybridMultilevel"/>
+    <w:tmpl w:val="E3283186"/>
+    <w:lvl w:ilvl="0" w:tplc="4F50036E">
+      <w:start w:val="1"/>
+      <w:numFmt w:val="bullet"/>
+      <w:lvlText w:val="•"/>
+      <w:lvlJc w:val="left"/>
+      <w:pPr>
+        <w:ind w:left="540" w:hanging="270"/>
+      </w:pPr>
+    </w:lvl>
+    <w:lvl w:ilvl="1" w:tplc="F58817C8">
+      <w:numFmt w:val="decimal"/>
+      <w:lvlText w:val=""/>
+      <w:lvlJc w:val="left"/>
+    </w:lvl>
+    <w:lvl w:ilvl="2" w:tplc="9412DEFC">
+      <w:numFmt w:val="decimal"/>
+      <w:lvlText w:val=""/>
+      <w:lvlJc w:val="left"/>
+    </w:lvl>
+    <w:lvl w:ilvl="3" w:tplc="F9200958">
+      <w:numFmt w:val="decimal"/>
+      <w:lvlText w:val=""/>
+      <w:lvlJc w:val="left"/>
+    </w:lvl>
+    <w:lvl w:ilvl="4" w:tplc="BD842904">
+      <w:numFmt w:val="decimal"/>
+      <w:lvlText w:val=""/>
+      <w:lvlJc w:val="left"/>
+    </w:lvl>
+    <w:lvl w:ilvl="5" w:tplc="D0806214">
+      <w:numFmt w:val="decimal"/>
+      <w:lvlText w:val=""/>
+      <w:lvlJc w:val="left"/>
+    </w:lvl>
+    <w:lvl w:ilvl="6" w:tplc="0A0CA7F2">
+      <w:numFmt w:val="decimal"/>
+      <w:lvlText w:val=""/>
+      <w:lvlJc w:val="left"/>
+    </w:lvl>
+    <w:lvl w:ilvl="7" w:tplc="64F6C7C6">
+      <w:numFmt w:val="decimal"/>
+      <w:lvlText w:val=""/>
+      <w:lvlJc w:val="left"/>
+    </w:lvl>
+    <w:lvl w:ilvl="8" w:tplc="8726355E">
+      <w:numFmt w:val="decimal"/>
+      <w:lvlText w:val=""/>
+      <w:lvlJc w:val="left"/>
+    </w:lvl>
+  </w:abstractNum>
+  <w:num w:numId="1" w16cid:durableId="1461922810">
+    <w:abstractNumId w:val="0"/>
     <w:lvlOverride w:ilvl="0">
       <w:startOverride w:val="1"/>
     </w:lvlOverride>
   </w:num>
-  <w:num w:numId="2" w16cid:durableId="279458498">
-    <w:abstractNumId w:val="0"/>
+  <w:num w:numId="2" w16cid:durableId="1271010223">
+    <w:abstractNumId w:val="1"/>
     <w:lvlOverride w:ilvl="0">
       <w:startOverride w:val="1"/>
     </w:lvlOverride>
@@ -7408,7 +8077,7 @@
     <w:autoRedefine/>
     <w:uiPriority w:val="39"/>
     <w:unhideWhenUsed/>
-    <w:rsid w:val="000C0EF3"/>
+    <w:rsid w:val="0081443B"/>
     <w:pPr>
       <w:spacing w:after="100"/>
     </w:pPr>
@@ -7420,7 +8089,7 @@
     <w:autoRedefine/>
     <w:uiPriority w:val="39"/>
     <w:unhideWhenUsed/>
-    <w:rsid w:val="000C0EF3"/>
+    <w:rsid w:val="0081443B"/>
     <w:pPr>
       <w:spacing w:after="100"/>
       <w:ind w:left="220"/>

</xml_diff>